<commit_message>
Prioritise Day 2 cost and observability with realistic exercises
Align both days to 09:45-17:30. Add mandatory cost investigation and budget design, schema-specific KQL and fictional fallbacks, a team incident exercise, revised handouts and slide PDFs. Instructor transcripts remain outside the student release.

Co-authored-by: Copilot <223556219+Copilot@users.noreply.github.com>
</commit_message>
<xml_diff>
--- a/V2/Day 1/00_DAY_1_ORDER.docx
+++ b/V2/Day 1/00_DAY_1_ORDER.docx
@@ -10,6 +10,351 @@
         <w:t>Day 1 - individual component exercises</w:t>
       </w:r>
     </w:p>
+    <w:p>
+      <w:pPr>
+        <w:pStyle w:val="Heading1"/>
+      </w:pPr>
+      <w:r>
+        <w:t>Confirmed delivery window - 09:45-17:30</w:t>
+      </w:r>
+    </w:p>
+    <w:p>
+      <w:r>
+        <w:t>The opening includes a 15-minute guided portal walkthrough before individual practice. SQL and Blob include short paired cost decisions: state the workload assumption, cost driver, safe recommendation and risk. Day 2 has a mandatory deeper Cost Management lab. Use existing assigned resources; optional creation guides are not required.</w:t>
+      </w:r>
+    </w:p>
+    <w:tbl>
+      <w:tblPr>
+        <w:tblStyle w:val="LightShading-Accent1"/>
+        <w:tblW w:type="auto" w:w="0"/>
+        <w:tblLook w:firstColumn="1" w:firstRow="1" w:lastColumn="0" w:lastRow="0" w:noHBand="0" w:noVBand="1" w:val="04A0"/>
+      </w:tblPr>
+      <w:tblGrid>
+        <w:gridCol w:w="3298"/>
+        <w:gridCol w:w="3298"/>
+        <w:gridCol w:w="3298"/>
+      </w:tblGrid>
+      <w:tr>
+        <w:tc>
+          <w:tcPr>
+            <w:tcW w:type="dxa" w:w="3298"/>
+          </w:tcPr>
+          <w:p>
+            <w:r>
+              <w:t>Start</w:t>
+            </w:r>
+          </w:p>
+        </w:tc>
+        <w:tc>
+          <w:tcPr>
+            <w:tcW w:type="dxa" w:w="3298"/>
+          </w:tcPr>
+          <w:p>
+            <w:r>
+              <w:t>Finish</w:t>
+            </w:r>
+          </w:p>
+        </w:tc>
+        <w:tc>
+          <w:tcPr>
+            <w:tcW w:type="dxa" w:w="3298"/>
+          </w:tcPr>
+          <w:p>
+            <w:r>
+              <w:t>Block</w:t>
+            </w:r>
+          </w:p>
+        </w:tc>
+      </w:tr>
+      <w:tr>
+        <w:tc>
+          <w:tcPr>
+            <w:tcW w:type="dxa" w:w="3298"/>
+          </w:tcPr>
+          <w:p>
+            <w:r>
+              <w:t>09:45</w:t>
+            </w:r>
+          </w:p>
+        </w:tc>
+        <w:tc>
+          <w:tcPr>
+            <w:tcW w:type="dxa" w:w="3298"/>
+          </w:tcPr>
+          <w:p>
+            <w:r>
+              <w:t>11:05</w:t>
+            </w:r>
+          </w:p>
+        </w:tc>
+        <w:tc>
+          <w:tcPr>
+            <w:tcW w:type="dxa" w:w="3298"/>
+          </w:tcPr>
+          <w:p>
+            <w:r>
+              <w:t>Welcome, introductions, foundations and orientation</w:t>
+            </w:r>
+          </w:p>
+        </w:tc>
+      </w:tr>
+      <w:tr>
+        <w:tc>
+          <w:tcPr>
+            <w:tcW w:type="dxa" w:w="3298"/>
+          </w:tcPr>
+          <w:p>
+            <w:r>
+              <w:t>11:05</w:t>
+            </w:r>
+          </w:p>
+        </w:tc>
+        <w:tc>
+          <w:tcPr>
+            <w:tcW w:type="dxa" w:w="3298"/>
+          </w:tcPr>
+          <w:p>
+            <w:r>
+              <w:t>12:20</w:t>
+            </w:r>
+          </w:p>
+        </w:tc>
+        <w:tc>
+          <w:tcPr>
+            <w:tcW w:type="dxa" w:w="3298"/>
+          </w:tcPr>
+          <w:p>
+            <w:r>
+              <w:t>SQL including cost decision</w:t>
+            </w:r>
+          </w:p>
+        </w:tc>
+      </w:tr>
+      <w:tr>
+        <w:tc>
+          <w:tcPr>
+            <w:tcW w:type="dxa" w:w="3298"/>
+          </w:tcPr>
+          <w:p>
+            <w:r>
+              <w:t>12:20</w:t>
+            </w:r>
+          </w:p>
+        </w:tc>
+        <w:tc>
+          <w:tcPr>
+            <w:tcW w:type="dxa" w:w="3298"/>
+          </w:tcPr>
+          <w:p>
+            <w:r>
+              <w:t>12:35</w:t>
+            </w:r>
+          </w:p>
+        </w:tc>
+        <w:tc>
+          <w:tcPr>
+            <w:tcW w:type="dxa" w:w="3298"/>
+          </w:tcPr>
+          <w:p>
+            <w:r>
+              <w:t>Break</w:t>
+            </w:r>
+          </w:p>
+        </w:tc>
+      </w:tr>
+      <w:tr>
+        <w:tc>
+          <w:tcPr>
+            <w:tcW w:type="dxa" w:w="3298"/>
+          </w:tcPr>
+          <w:p>
+            <w:r>
+              <w:t>12:35</w:t>
+            </w:r>
+          </w:p>
+        </w:tc>
+        <w:tc>
+          <w:tcPr>
+            <w:tcW w:type="dxa" w:w="3298"/>
+          </w:tcPr>
+          <w:p>
+            <w:r>
+              <w:t>13:40</w:t>
+            </w:r>
+          </w:p>
+        </w:tc>
+        <w:tc>
+          <w:tcPr>
+            <w:tcW w:type="dxa" w:w="3298"/>
+          </w:tcPr>
+          <w:p>
+            <w:r>
+              <w:t>Blob including cost decision</w:t>
+            </w:r>
+          </w:p>
+        </w:tc>
+      </w:tr>
+      <w:tr>
+        <w:tc>
+          <w:tcPr>
+            <w:tcW w:type="dxa" w:w="3298"/>
+          </w:tcPr>
+          <w:p>
+            <w:r>
+              <w:t>13:40</w:t>
+            </w:r>
+          </w:p>
+        </w:tc>
+        <w:tc>
+          <w:tcPr>
+            <w:tcW w:type="dxa" w:w="3298"/>
+          </w:tcPr>
+          <w:p>
+            <w:r>
+              <w:t>14:25</w:t>
+            </w:r>
+          </w:p>
+        </w:tc>
+        <w:tc>
+          <w:tcPr>
+            <w:tcW w:type="dxa" w:w="3298"/>
+          </w:tcPr>
+          <w:p>
+            <w:r>
+              <w:t>Lunch</w:t>
+            </w:r>
+          </w:p>
+        </w:tc>
+      </w:tr>
+      <w:tr>
+        <w:tc>
+          <w:tcPr>
+            <w:tcW w:type="dxa" w:w="3298"/>
+          </w:tcPr>
+          <w:p>
+            <w:r>
+              <w:t>14:25</w:t>
+            </w:r>
+          </w:p>
+        </w:tc>
+        <w:tc>
+          <w:tcPr>
+            <w:tcW w:type="dxa" w:w="3298"/>
+          </w:tcPr>
+          <w:p>
+            <w:r>
+              <w:t>15:40</w:t>
+            </w:r>
+          </w:p>
+        </w:tc>
+        <w:tc>
+          <w:tcPr>
+            <w:tcW w:type="dxa" w:w="3298"/>
+          </w:tcPr>
+          <w:p>
+            <w:r>
+              <w:t>Function</w:t>
+            </w:r>
+          </w:p>
+        </w:tc>
+      </w:tr>
+      <w:tr>
+        <w:tc>
+          <w:tcPr>
+            <w:tcW w:type="dxa" w:w="3298"/>
+          </w:tcPr>
+          <w:p>
+            <w:r>
+              <w:t>15:40</w:t>
+            </w:r>
+          </w:p>
+        </w:tc>
+        <w:tc>
+          <w:tcPr>
+            <w:tcW w:type="dxa" w:w="3298"/>
+          </w:tcPr>
+          <w:p>
+            <w:r>
+              <w:t>15:55</w:t>
+            </w:r>
+          </w:p>
+        </w:tc>
+        <w:tc>
+          <w:tcPr>
+            <w:tcW w:type="dxa" w:w="3298"/>
+          </w:tcPr>
+          <w:p>
+            <w:r>
+              <w:t>Break</w:t>
+            </w:r>
+          </w:p>
+        </w:tc>
+      </w:tr>
+      <w:tr>
+        <w:tc>
+          <w:tcPr>
+            <w:tcW w:type="dxa" w:w="3298"/>
+          </w:tcPr>
+          <w:p>
+            <w:r>
+              <w:t>15:55</w:t>
+            </w:r>
+          </w:p>
+        </w:tc>
+        <w:tc>
+          <w:tcPr>
+            <w:tcW w:type="dxa" w:w="3298"/>
+          </w:tcPr>
+          <w:p>
+            <w:r>
+              <w:t>16:50</w:t>
+            </w:r>
+          </w:p>
+        </w:tc>
+        <w:tc>
+          <w:tcPr>
+            <w:tcW w:type="dxa" w:w="3298"/>
+          </w:tcPr>
+          <w:p>
+            <w:r>
+              <w:t>Logs/KQL</w:t>
+            </w:r>
+          </w:p>
+        </w:tc>
+      </w:tr>
+      <w:tr>
+        <w:tc>
+          <w:tcPr>
+            <w:tcW w:type="dxa" w:w="3298"/>
+          </w:tcPr>
+          <w:p>
+            <w:r>
+              <w:t>16:50</w:t>
+            </w:r>
+          </w:p>
+        </w:tc>
+        <w:tc>
+          <w:tcPr>
+            <w:tcW w:type="dxa" w:w="3298"/>
+          </w:tcPr>
+          <w:p>
+            <w:r>
+              <w:t>17:30</w:t>
+            </w:r>
+          </w:p>
+        </w:tc>
+        <w:tc>
+          <w:tcPr>
+            <w:tcW w:type="dxa" w:w="3298"/>
+          </w:tcPr>
+          <w:p>
+            <w:r>
+              <w:t>Troubleshooting, knowledge check, cost recap and cleanup</w:t>
+            </w:r>
+          </w:p>
+        </w:tc>
+      </w:tr>
+    </w:tbl>
     <w:p>
       <w:pPr>
         <w:pStyle w:val="Heading1"/>

</xml_diff>